<commit_message>
[v1.21] Upload paper/Class_11/Section_A/11_A_Physics_Descriptive_Paper_Admin.docx: Fix chapter suggestions, official blueprint auto-population, math LaTeX rendering, and template auto-reload
</commit_message>
<xml_diff>
--- a/paper/Class_11/Section_A/11_A_Physics_Descriptive_Paper_Admin.docx
+++ b/paper/Class_11/Section_A/11_A_Physics_Descriptive_Paper_Admin.docx
@@ -54,7 +54,19 @@
           <w:color w:val="1E1B4B"/>
           <w:sz w:val="32"/>
         </w:rPr>
-        <w:t>RRB GROUP OF SCHOOLS</w:t>
+        <w:t>LOTUS ACADEMY</w:t>
+      </w:r>
+    </w:p>
+    <w:p>
+      <w:pPr>
+        <w:jc w:val="center"/>
+      </w:pPr>
+      <w:r>
+        <w:rPr>
+          <w:color w:val="64748B"/>
+          <w:sz w:val="19"/>
+        </w:rPr>
+        <w:t>Pathak Market ADA Naini Prayagraj</w:t>
       </w:r>
     </w:p>
     <w:p>
@@ -66,7 +78,7 @@
           <w:b/>
           <w:sz w:val="22"/>
         </w:rPr>
-        <w:t>DESCRIPTIVE PAPER — UNIT TEST</w:t>
+        <w:t>DESCRIPTIVE PAPER — UNIT TEST (Academic Session: 2026-27)</w:t>
       </w:r>
     </w:p>
     <w:p>
@@ -117,7 +129,7 @@
                 <w:b/>
                 <w:sz w:val="19"/>
               </w:rPr>
-              <w:t>Time Allowed: 2 Hours</w:t>
+              <w:t>Time Allowed: 1.5 Hours</w:t>
             </w:r>
           </w:p>
         </w:tc>
@@ -134,7 +146,7 @@
                 <w:b/>
                 <w:sz w:val="19"/>
               </w:rPr>
-              <w:t>Maximum Marks (MM): 50</w:t>
+              <w:t>Maximum Marks (MM): 30</w:t>
             </w:r>
           </w:p>
         </w:tc>
@@ -165,7 +177,7 @@
               <w:rPr>
                 <w:sz w:val="18"/>
               </w:rPr>
-              <w:t>Date: 05/09/2026</w:t>
+              <w:t>Date: 17/09/2026</w:t>
             </w:r>
           </w:p>
         </w:tc>
@@ -193,7 +205,7 @@
           <w:color w:val="1E1B4B"/>
           <w:sz w:val="22"/>
         </w:rPr>
-        <w:t>Section A: Multiple Choice Questions</w:t>
+        <w:t>Section A: Multiple Choice Questions (MCQ)</w:t>
       </w:r>
     </w:p>
     <w:p>
@@ -207,7 +219,7 @@
           <w:color w:val="64748B"/>
           <w:sz w:val="18"/>
         </w:rPr>
-        <w:t>Note: Choose the correct option for each of the following questions.</w:t>
+        <w:t>Note: Choose the correct option from (a), (b), (c), or (d).</w:t>
       </w:r>
     </w:p>
     <w:p>
@@ -225,7 +237,7 @@
         <w:rPr>
           <w:sz w:val="20"/>
         </w:rPr>
-        <w:t>A particle of mass $m$ is moving in a circular path of radius $r$ under the action of a centripetal force $F = - \frac{k}{r^2}$ where $k$ is a positive constant. The total energy of the particle is:</w:t>
+        <w:t>Which of the following is not a self-adjusting force?</w:t>
       </w:r>
     </w:p>
     <w:p>
@@ -250,7 +262,7 @@
         <w:rPr>
           <w:sz w:val="20"/>
         </w:rPr>
-        <w:t>(a) $-\frac{k}{2r}$</w:t>
+        <w:t>(a) Static friction</w:t>
       </w:r>
     </w:p>
     <w:p>
@@ -262,7 +274,7 @@
         <w:rPr>
           <w:sz w:val="20"/>
         </w:rPr>
-        <w:t>(b) $\frac{k}{2r}$</w:t>
+        <w:t>(b) Limiting friction</w:t>
       </w:r>
     </w:p>
     <w:p>
@@ -274,7 +286,7 @@
         <w:rPr>
           <w:sz w:val="20"/>
         </w:rPr>
-        <w:t>(c) $-\frac{k}{r}$</w:t>
+        <w:t>(c) Kinetic friction</w:t>
       </w:r>
     </w:p>
     <w:p>
@@ -286,7 +298,7 @@
         <w:rPr>
           <w:sz w:val="20"/>
         </w:rPr>
-        <w:t>(d) $\frac{k}{r}$</w:t>
+        <w:t>(d) Tension in a string</w:t>
       </w:r>
     </w:p>
     <w:p>
@@ -304,7 +316,20 @@
         <w:rPr>
           <w:sz w:val="20"/>
         </w:rPr>
-        <w:t>A block of mass $m$ is placed on a rough inclined plane of inclination $\theta$ keeping horizontal. If the coefficient of static friction is $\mu_s$, the minimum force $F$ required to move the block up the inclined plane is:</w:t>
+        <w:t>A body of mass  m  is placed on a rough surface with coefficient of static friction  μ</w:t>
+      </w:r>
+      <w:r>
+        <w:rPr>
+          <w:sz w:val="20"/>
+          <w:vertAlign w:val="subscript"/>
+        </w:rPr>
+        <w:t>s</w:t>
+      </w:r>
+      <w:r>
+        <w:rPr>
+          <w:sz w:val="20"/>
+        </w:rPr>
+        <w:t xml:space="preserve"> . The maximum force of static friction is given by:</w:t>
       </w:r>
     </w:p>
     <w:p>
@@ -329,7 +354,33 @@
         <w:rPr>
           <w:sz w:val="20"/>
         </w:rPr>
-        <w:t>(a) $mg \sin\theta$</w:t>
+        <w:t>(a)  f</w:t>
+      </w:r>
+      <w:r>
+        <w:rPr>
+          <w:sz w:val="20"/>
+          <w:vertAlign w:val="subscript"/>
+        </w:rPr>
+        <w:t>s</w:t>
+      </w:r>
+      <w:r>
+        <w:rPr>
+          <w:sz w:val="20"/>
+        </w:rPr>
+        <w:t xml:space="preserve"> = μ</w:t>
+      </w:r>
+      <w:r>
+        <w:rPr>
+          <w:sz w:val="20"/>
+          <w:vertAlign w:val="subscript"/>
+        </w:rPr>
+        <w:t>s</w:t>
+      </w:r>
+      <w:r>
+        <w:rPr>
+          <w:sz w:val="20"/>
+        </w:rPr>
+        <w:t xml:space="preserve"> mg </w:t>
       </w:r>
     </w:p>
     <w:p>
@@ -341,7 +392,33 @@
         <w:rPr>
           <w:sz w:val="20"/>
         </w:rPr>
-        <w:t>(b) $mg(\sin\theta + \mu_s \cos\theta)$</w:t>
+        <w:t>(b)  f</w:t>
+      </w:r>
+      <w:r>
+        <w:rPr>
+          <w:sz w:val="20"/>
+          <w:vertAlign w:val="subscript"/>
+        </w:rPr>
+        <w:t>s</w:t>
+      </w:r>
+      <w:r>
+        <w:rPr>
+          <w:sz w:val="20"/>
+        </w:rPr>
+        <w:t xml:space="preserve"> &lt; μ</w:t>
+      </w:r>
+      <w:r>
+        <w:rPr>
+          <w:sz w:val="20"/>
+          <w:vertAlign w:val="subscript"/>
+        </w:rPr>
+        <w:t>s</w:t>
+      </w:r>
+      <w:r>
+        <w:rPr>
+          <w:sz w:val="20"/>
+        </w:rPr>
+        <w:t xml:space="preserve"> mg </w:t>
       </w:r>
     </w:p>
     <w:p>
@@ -353,7 +430,33 @@
         <w:rPr>
           <w:sz w:val="20"/>
         </w:rPr>
-        <w:t>(c) $mg(\sin\theta - \mu_s \cos\theta)$</w:t>
+        <w:t>(c)  f</w:t>
+      </w:r>
+      <w:r>
+        <w:rPr>
+          <w:sz w:val="20"/>
+          <w:vertAlign w:val="subscript"/>
+        </w:rPr>
+        <w:t>s</w:t>
+      </w:r>
+      <w:r>
+        <w:rPr>
+          <w:sz w:val="20"/>
+        </w:rPr>
+        <w:t xml:space="preserve"> ≤ μ</w:t>
+      </w:r>
+      <w:r>
+        <w:rPr>
+          <w:sz w:val="20"/>
+          <w:vertAlign w:val="subscript"/>
+        </w:rPr>
+        <w:t>s</w:t>
+      </w:r>
+      <w:r>
+        <w:rPr>
+          <w:sz w:val="20"/>
+        </w:rPr>
+        <w:t xml:space="preserve"> mg </w:t>
       </w:r>
     </w:p>
     <w:p>
@@ -365,7 +468,33 @@
         <w:rPr>
           <w:sz w:val="20"/>
         </w:rPr>
-        <w:t>(d) $\mu_s mg \cos\theta$</w:t>
+        <w:t>(d)  f</w:t>
+      </w:r>
+      <w:r>
+        <w:rPr>
+          <w:sz w:val="20"/>
+          <w:vertAlign w:val="subscript"/>
+        </w:rPr>
+        <w:t>s</w:t>
+      </w:r>
+      <w:r>
+        <w:rPr>
+          <w:sz w:val="20"/>
+        </w:rPr>
+        <w:t xml:space="preserve"> &gt; μ</w:t>
+      </w:r>
+      <w:r>
+        <w:rPr>
+          <w:sz w:val="20"/>
+          <w:vertAlign w:val="subscript"/>
+        </w:rPr>
+        <w:t>s</w:t>
+      </w:r>
+      <w:r>
+        <w:rPr>
+          <w:sz w:val="20"/>
+        </w:rPr>
+        <w:t xml:space="preserve"> mg </w:t>
       </w:r>
     </w:p>
     <w:p>
@@ -383,128 +512,7 @@
         <w:rPr>
           <w:sz w:val="20"/>
         </w:rPr>
-        <w:t>Three blocks of masses $m_1$, $m_2$ and $m_3$ are connected as shown in the system. If a force $F$ is applied to mass $m_3$, the tension $T_1$ between $m_1$ and $m_2$ is:</w:t>
-      </w:r>
-    </w:p>
-    <w:p>
-      <w:pPr>
-        <w:spacing w:before="0" w:after="40"/>
-      </w:pPr>
-      <w:r>
-        <w:rPr>
-          <w:b/>
-          <w:color w:val="64748B"/>
-          <w:sz w:val="17"/>
-        </w:rPr>
-        <w:t>[1M]</w:t>
-      </w:r>
-    </w:p>
-    <w:p>
-      <w:pPr>
-        <w:spacing w:before="80" w:after="120"/>
-        <w:jc w:val="center"/>
-      </w:pPr>
-    </w:p>
-    <w:p>
-      <w:r>
-        <w:drawing>
-          <wp:inline xmlns:a="http://schemas.openxmlformats.org/drawingml/2006/main" xmlns:pic="http://schemas.openxmlformats.org/drawingml/2006/picture">
-            <wp:extent cx="2926080" cy="1116450"/>
-            <wp:docPr id="2" name="Picture 2"/>
-            <wp:cNvGraphicFramePr>
-              <a:graphicFrameLocks noChangeAspect="1"/>
-            </wp:cNvGraphicFramePr>
-            <a:graphic>
-              <a:graphicData uri="http://schemas.openxmlformats.org/drawingml/2006/picture">
-                <pic:pic>
-                  <pic:nvPicPr>
-                    <pic:cNvPr id="0" name="class3_4_fractions_visual.png"/>
-                    <pic:cNvPicPr/>
-                  </pic:nvPicPr>
-                  <pic:blipFill>
-                    <a:blip r:embed="rId12"/>
-                    <a:stretch>
-                      <a:fillRect/>
-                    </a:stretch>
-                  </pic:blipFill>
-                  <pic:spPr>
-                    <a:xfrm>
-                      <a:off x="0" y="0"/>
-                      <a:ext cx="2926080" cy="1116450"/>
-                    </a:xfrm>
-                    <a:prstGeom prst="rect"/>
-                  </pic:spPr>
-                </pic:pic>
-              </a:graphicData>
-            </a:graphic>
-          </wp:inline>
-        </w:drawing>
-      </w:r>
-    </w:p>
-    <w:p>
-      <w:pPr>
-        <w:spacing w:before="80" w:after="40" w:line="276" w:lineRule="auto"/>
-        <w:ind w:left="454"/>
-      </w:pPr>
-      <w:r>
-        <w:rPr>
-          <w:sz w:val="20"/>
-        </w:rPr>
-        <w:t>(a) $\frac{m_1 F}{m_1 + m_2 + m_3}$</w:t>
-      </w:r>
-    </w:p>
-    <w:p>
-      <w:pPr>
-        <w:spacing w:before="80" w:after="40" w:line="276" w:lineRule="auto"/>
-        <w:ind w:left="454"/>
-      </w:pPr>
-      <w:r>
-        <w:rPr>
-          <w:sz w:val="20"/>
-        </w:rPr>
-        <w:t>(b) $\frac{(m_1 + m_2)F}{m_1 + m_2 + m_3}$</w:t>
-      </w:r>
-    </w:p>
-    <w:p>
-      <w:pPr>
-        <w:spacing w:before="80" w:after="40" w:line="276" w:lineRule="auto"/>
-        <w:ind w:left="454"/>
-      </w:pPr>
-      <w:r>
-        <w:rPr>
-          <w:sz w:val="20"/>
-        </w:rPr>
-        <w:t>(c) $\frac{m_3 F}{m_1 + m_2 + m_3}$</w:t>
-      </w:r>
-    </w:p>
-    <w:p>
-      <w:pPr>
-        <w:spacing w:before="80" w:after="40" w:line="276" w:lineRule="auto"/>
-        <w:ind w:left="454"/>
-      </w:pPr>
-      <w:r>
-        <w:rPr>
-          <w:sz w:val="20"/>
-        </w:rPr>
-        <w:t>(d) $\frac{(m_2 + m_3)F}{m_1 + m_2 + m_3}$</w:t>
-      </w:r>
-    </w:p>
-    <w:p>
-      <w:pPr>
-        <w:spacing w:before="80" w:after="40" w:line="276" w:lineRule="auto"/>
-      </w:pPr>
-      <w:r>
-        <w:rPr>
-          <w:b/>
-          <w:sz w:val="20"/>
-        </w:rPr>
-        <w:t xml:space="preserve">Q4. </w:t>
-      </w:r>
-      <w:r>
-        <w:rPr>
-          <w:sz w:val="20"/>
-        </w:rPr>
-        <w:t>A bullet of mass $0.05\text{ kg}$ moving with a speed of $200\text{ m/s}$ enters a heavy wooden block and is stopped after a distance of $0.5\text{ m}$. What is the average resistive force exerted by the block on the bullet?</w:t>
+        <w:t>An object of mass  10\ kg  is sliding on a frictionless surface with a constant velocity of  5\ m/s . The net force acting on the object is:</w:t>
       </w:r>
     </w:p>
     <w:p>
@@ -529,7 +537,7 @@
         <w:rPr>
           <w:sz w:val="20"/>
         </w:rPr>
-        <w:t>(a) $2000\text{ N}$</w:t>
+        <w:t xml:space="preserve">(a)  50\ N </w:t>
       </w:r>
     </w:p>
     <w:p>
@@ -541,7 +549,7 @@
         <w:rPr>
           <w:sz w:val="20"/>
         </w:rPr>
-        <w:t>(b) $4000\text{ N}$</w:t>
+        <w:t xml:space="preserve">(b)  10\ N </w:t>
       </w:r>
     </w:p>
     <w:p>
@@ -553,7 +561,7 @@
         <w:rPr>
           <w:sz w:val="20"/>
         </w:rPr>
-        <w:t>(c) $200\text{ N}$</w:t>
+        <w:t xml:space="preserve">(c)  0\ N </w:t>
       </w:r>
     </w:p>
     <w:p>
@@ -565,7 +573,7 @@
         <w:rPr>
           <w:sz w:val="20"/>
         </w:rPr>
-        <w:t>(d) $400\text{ N}$</w:t>
+        <w:t xml:space="preserve">(d)  5\ N </w:t>
       </w:r>
     </w:p>
     <w:p>
@@ -577,13 +585,13 @@
           <w:b/>
           <w:sz w:val="20"/>
         </w:rPr>
-        <w:t xml:space="preserve">Q5. </w:t>
+        <w:t xml:space="preserve">Q4. </w:t>
       </w:r>
       <w:r>
         <w:rPr>
           <w:sz w:val="20"/>
         </w:rPr>
-        <w:t>A rocket with a lift-off mass $20,000\text{ kg}$ is blasted upwards with an initial acceleration of $5.0\text{ m/s}^2$. The initial thrust of the blast is ($g = 10\text{ m/s}^2$):</w:t>
+        <w:t>The apparent weight of a person inside a lift moving upward with an acceleration  a  is:</w:t>
       </w:r>
     </w:p>
     <w:p>
@@ -608,7 +616,7 @@
         <w:rPr>
           <w:sz w:val="20"/>
         </w:rPr>
-        <w:t>(a) $1.0 \times 10^5\text{ N}$</w:t>
+        <w:t xml:space="preserve">(a)  m(g - a) </w:t>
       </w:r>
     </w:p>
     <w:p>
@@ -620,7 +628,7 @@
         <w:rPr>
           <w:sz w:val="20"/>
         </w:rPr>
-        <w:t>(b) $2.0 \times 10^5\text{ N}$</w:t>
+        <w:t xml:space="preserve">(b)  m(g + a) </w:t>
       </w:r>
     </w:p>
     <w:p>
@@ -632,7 +640,7 @@
         <w:rPr>
           <w:sz w:val="20"/>
         </w:rPr>
-        <w:t>(c) $3.0 \times 10^5\text{ N}$</w:t>
+        <w:t xml:space="preserve">(c)  mg </w:t>
       </w:r>
     </w:p>
     <w:p>
@@ -644,7 +652,7 @@
         <w:rPr>
           <w:sz w:val="20"/>
         </w:rPr>
-        <w:t>(d) $3.5 \times 10^5\text{ N}$</w:t>
+        <w:t xml:space="preserve">(d)  m √{g↑2 + a↑2} </w:t>
       </w:r>
     </w:p>
     <w:p>
@@ -656,13 +664,13 @@
           <w:b/>
           <w:sz w:val="20"/>
         </w:rPr>
-        <w:t xml:space="preserve">Q6. </w:t>
+        <w:t xml:space="preserve">Q5. </w:t>
       </w:r>
       <w:r>
         <w:rPr>
           <w:sz w:val="20"/>
         </w:rPr>
-        <w:t>A body of mass $2\text{ kg}$ travels according to the relation $x(t) = pt^3 + qt^2 + rt$, where constants are $p = 3\text{ m/s}^3$, $q = 4\text{ m/s}^2$, and $r = 5\text{ m/s}$. The force acting on the body at $t = 2\text{ s}$ is:</w:t>
+        <w:t>A bullet of mass  0.04\ kg  moving with a speed of  90\ m/s  enters a heavy wooden block and is stopped within a distance of  60\ cm . The average resistive force exerted by the block on the bullet is:</w:t>
       </w:r>
     </w:p>
     <w:p>
@@ -687,7 +695,7 @@
         <w:rPr>
           <w:sz w:val="20"/>
         </w:rPr>
-        <w:t>(a) $64\text{ N}$</w:t>
+        <w:t xml:space="preserve">(a)  270\ N </w:t>
       </w:r>
     </w:p>
     <w:p>
@@ -699,7 +707,7 @@
         <w:rPr>
           <w:sz w:val="20"/>
         </w:rPr>
-        <w:t>(b) $32\text{ N}$</w:t>
+        <w:t xml:space="preserve">(b)  540\ N </w:t>
       </w:r>
     </w:p>
     <w:p>
@@ -711,7 +719,7 @@
         <w:rPr>
           <w:sz w:val="20"/>
         </w:rPr>
-        <w:t>(c) $128\text{ N}$</w:t>
+        <w:t xml:space="preserve">(c)  300\ N </w:t>
       </w:r>
     </w:p>
     <w:p>
@@ -723,7 +731,7 @@
         <w:rPr>
           <w:sz w:val="20"/>
         </w:rPr>
-        <w:t>(d) $16\text{ N}$</w:t>
+        <w:t xml:space="preserve">(d)  810\ N </w:t>
       </w:r>
     </w:p>
     <w:p>
@@ -735,13 +743,13 @@
           <w:b/>
           <w:sz w:val="20"/>
         </w:rPr>
-        <w:t xml:space="preserve">Q7. </w:t>
+        <w:t xml:space="preserve">Q6. </w:t>
       </w:r>
       <w:r>
         <w:rPr>
           <w:sz w:val="20"/>
         </w:rPr>
-        <w:t>The coefficient of friction between a tire and a road is $0.4$. The maximum safe speed of a car of mass $1000\text{ kg}$ to negotiate a circular curve of radius $100\text{ m}$ without skidding is ($g = 10\text{ m/s}^2$):</w:t>
+        <w:t>Linear momentum of a particle is given by  p⃗ = mv⃗ . According to Newton's second law, the net force acting on the particle is equal to:</w:t>
       </w:r>
     </w:p>
     <w:p>
@@ -766,7 +774,7 @@
         <w:rPr>
           <w:sz w:val="20"/>
         </w:rPr>
-        <w:t>(a) $20\text{ m/s}$</w:t>
+        <w:t xml:space="preserve">(a)  (dv⃗ / dt) </w:t>
       </w:r>
     </w:p>
     <w:p>
@@ -778,7 +786,7 @@
         <w:rPr>
           <w:sz w:val="20"/>
         </w:rPr>
-        <w:t>(b) $40\text{ m/s}$</w:t>
+        <w:t xml:space="preserve">(b)  (dp⃗ / dt) </w:t>
       </w:r>
     </w:p>
     <w:p>
@@ -790,7 +798,7 @@
         <w:rPr>
           <w:sz w:val="20"/>
         </w:rPr>
-        <w:t>(c) $10\text{ m/s}$</w:t>
+        <w:t xml:space="preserve">(c)  p⃗ × v⃗ </w:t>
       </w:r>
     </w:p>
     <w:p>
@@ -802,244 +810,7 @@
         <w:rPr>
           <w:sz w:val="20"/>
         </w:rPr>
-        <w:t>(d) $15\text{ m/s}$</w:t>
-      </w:r>
-    </w:p>
-    <w:p>
-      <w:pPr>
-        <w:spacing w:before="80" w:after="40" w:line="276" w:lineRule="auto"/>
-      </w:pPr>
-      <w:r>
-        <w:rPr>
-          <w:b/>
-          <w:sz w:val="20"/>
-        </w:rPr>
-        <w:t xml:space="preserve">Q8. </w:t>
-      </w:r>
-      <w:r>
-        <w:rPr>
-          <w:sz w:val="20"/>
-        </w:rPr>
-        <w:t>A chain of mass $M$ and length $L$ is hanging over a smooth table with $1/n$th of its length hanging freely. The work done in pulling the hanging part back on the table is:</w:t>
-      </w:r>
-    </w:p>
-    <w:p>
-      <w:pPr>
-        <w:spacing w:before="0" w:after="40"/>
-      </w:pPr>
-      <w:r>
-        <w:rPr>
-          <w:b/>
-          <w:color w:val="64748B"/>
-          <w:sz w:val="17"/>
-        </w:rPr>
-        <w:t>[1M]</w:t>
-      </w:r>
-    </w:p>
-    <w:p>
-      <w:pPr>
-        <w:spacing w:before="80" w:after="40" w:line="276" w:lineRule="auto"/>
-        <w:ind w:left="454"/>
-      </w:pPr>
-      <w:r>
-        <w:rPr>
-          <w:sz w:val="20"/>
-        </w:rPr>
-        <w:t>(a) $\frac{MgL}{n^2}$</w:t>
-      </w:r>
-    </w:p>
-    <w:p>
-      <w:pPr>
-        <w:spacing w:before="80" w:after="40" w:line="276" w:lineRule="auto"/>
-        <w:ind w:left="454"/>
-      </w:pPr>
-      <w:r>
-        <w:rPr>
-          <w:sz w:val="20"/>
-        </w:rPr>
-        <w:t>(b) $\frac{MgL}{2n^2}$</w:t>
-      </w:r>
-    </w:p>
-    <w:p>
-      <w:pPr>
-        <w:spacing w:before="80" w:after="40" w:line="276" w:lineRule="auto"/>
-        <w:ind w:left="454"/>
-      </w:pPr>
-      <w:r>
-        <w:rPr>
-          <w:sz w:val="20"/>
-        </w:rPr>
-        <w:t>(c) $\frac{MgL}{n}$</w:t>
-      </w:r>
-    </w:p>
-    <w:p>
-      <w:pPr>
-        <w:spacing w:before="80" w:after="40" w:line="276" w:lineRule="auto"/>
-        <w:ind w:left="454"/>
-      </w:pPr>
-      <w:r>
-        <w:rPr>
-          <w:sz w:val="20"/>
-        </w:rPr>
-        <w:t>(d) $\frac{MgL}{2n}$</w:t>
-      </w:r>
-    </w:p>
-    <w:p>
-      <w:pPr>
-        <w:spacing w:before="80" w:after="40" w:line="276" w:lineRule="auto"/>
-      </w:pPr>
-      <w:r>
-        <w:rPr>
-          <w:b/>
-          <w:sz w:val="20"/>
-        </w:rPr>
-        <w:t xml:space="preserve">Q9. </w:t>
-      </w:r>
-      <w:r>
-        <w:rPr>
-          <w:sz w:val="20"/>
-        </w:rPr>
-        <w:t>An elevator accelerates upwards with an acceleration $a$. A person inside the elevator weighs a body using a spring balance. The reading of the spring balance compared to the true weight is:</w:t>
-      </w:r>
-    </w:p>
-    <w:p>
-      <w:pPr>
-        <w:spacing w:before="0" w:after="40"/>
-      </w:pPr>
-      <w:r>
-        <w:rPr>
-          <w:b/>
-          <w:color w:val="64748B"/>
-          <w:sz w:val="17"/>
-        </w:rPr>
-        <w:t>[1M]</w:t>
-      </w:r>
-    </w:p>
-    <w:p>
-      <w:pPr>
-        <w:spacing w:before="80" w:after="40" w:line="276" w:lineRule="auto"/>
-        <w:ind w:left="454"/>
-      </w:pPr>
-      <w:r>
-        <w:rPr>
-          <w:sz w:val="20"/>
-        </w:rPr>
-        <w:t>(a) less than true weight</w:t>
-      </w:r>
-    </w:p>
-    <w:p>
-      <w:pPr>
-        <w:spacing w:before="80" w:after="40" w:line="276" w:lineRule="auto"/>
-        <w:ind w:left="454"/>
-      </w:pPr>
-      <w:r>
-        <w:rPr>
-          <w:sz w:val="20"/>
-        </w:rPr>
-        <w:t>(b) greater than true weight</w:t>
-      </w:r>
-    </w:p>
-    <w:p>
-      <w:pPr>
-        <w:spacing w:before="80" w:after="40" w:line="276" w:lineRule="auto"/>
-        <w:ind w:left="454"/>
-      </w:pPr>
-      <w:r>
-        <w:rPr>
-          <w:sz w:val="20"/>
-        </w:rPr>
-        <w:t>(c) equal to true weight</w:t>
-      </w:r>
-    </w:p>
-    <w:p>
-      <w:pPr>
-        <w:spacing w:before="80" w:after="40" w:line="276" w:lineRule="auto"/>
-        <w:ind w:left="454"/>
-      </w:pPr>
-      <w:r>
-        <w:rPr>
-          <w:sz w:val="20"/>
-        </w:rPr>
-        <w:t>id) zero</w:t>
-      </w:r>
-    </w:p>
-    <w:p>
-      <w:pPr>
-        <w:spacing w:before="80" w:after="40" w:line="276" w:lineRule="auto"/>
-      </w:pPr>
-      <w:r>
-        <w:rPr>
-          <w:b/>
-          <w:sz w:val="20"/>
-        </w:rPr>
-        <w:t xml:space="preserve">Q10. </w:t>
-      </w:r>
-      <w:r>
-        <w:rPr>
-          <w:sz w:val="20"/>
-        </w:rPr>
-        <w:t>A force vector applied on a mass is represented as $\vec{F} = (6\hat{i} - 8\hat{j} + 10\hat{k})\text{ N}$ and accelerates the mass at $1\text{ m/s}^2$. What is the mass of the body?</w:t>
-      </w:r>
-    </w:p>
-    <w:p>
-      <w:pPr>
-        <w:spacing w:before="0" w:after="40"/>
-      </w:pPr>
-      <w:r>
-        <w:rPr>
-          <w:b/>
-          <w:color w:val="64748B"/>
-          <w:sz w:val="17"/>
-        </w:rPr>
-        <w:t>[1M]</w:t>
-      </w:r>
-    </w:p>
-    <w:p>
-      <w:pPr>
-        <w:spacing w:before="80" w:after="40" w:line="276" w:lineRule="auto"/>
-        <w:ind w:left="454"/>
-      </w:pPr>
-      <w:r>
-        <w:rPr>
-          <w:sz w:val="20"/>
-        </w:rPr>
-        <w:t>(a) $10\sqrt{2}\text{ kg}$</w:t>
-      </w:r>
-    </w:p>
-    <w:p>
-      <w:pPr>
-        <w:spacing w:before="80" w:after="40" w:line="276" w:lineRule="auto"/>
-        <w:ind w:left="454"/>
-      </w:pPr>
-      <w:r>
-        <w:rPr>
-          <w:sz w:val="20"/>
-        </w:rPr>
-        <w:t>(b) $2\sqrt{10}\text{ kg}$</w:t>
-      </w:r>
-    </w:p>
-    <w:p>
-      <w:pPr>
-        <w:spacing w:before="80" w:after="40" w:line="276" w:lineRule="auto"/>
-        <w:ind w:left="454"/>
-      </w:pPr>
-      <w:r>
-        <w:rPr>
-          <w:sz w:val="20"/>
-        </w:rPr>
-        <w:t>(c) $10\text{ kg}$</w:t>
-      </w:r>
-    </w:p>
-    <w:p>
-      <w:pPr>
-        <w:spacing w:before="80" w:after="40" w:line="276" w:lineRule="auto"/>
-        <w:ind w:left="454"/>
-      </w:pPr>
-      <w:r>
-        <w:rPr>
-          <w:sz w:val="20"/>
-        </w:rPr>
-        <w:t>(d) $100\text{ kg}$</w:t>
+        <w:t xml:space="preserve">(d)  m (d↑2r⃗ / dt↑2) </w:t>
       </w:r>
     </w:p>
     <w:p>
@@ -1067,7 +838,7 @@
           <w:color w:val="64748B"/>
           <w:sz w:val="18"/>
         </w:rPr>
-        <w:t>Note: Fill in the blanks with appropriate words or expressions.</w:t>
+        <w:t>Note: Fill in the blanks with appropriate terms.</w:t>
       </w:r>
     </w:p>
     <w:p>
@@ -1079,7 +850,7 @@
           <w:b/>
           <w:sz w:val="20"/>
         </w:rPr>
-        <w:t xml:space="preserve">Q1. </w:t>
+        <w:t xml:space="preserve">Q7. </w:t>
       </w:r>
       <w:r>
         <w:rPr>
@@ -1110,75 +881,13 @@
           <w:b/>
           <w:sz w:val="20"/>
         </w:rPr>
-        <w:t xml:space="preserve">Q2. </w:t>
+        <w:t xml:space="preserve">Q8. </w:t>
       </w:r>
       <w:r>
         <w:rPr>
           <w:sz w:val="20"/>
         </w:rPr>
-        <w:t>The impulse of a force is equal to the change in _______ of the body.</w:t>
-      </w:r>
-    </w:p>
-    <w:p>
-      <w:pPr>
-        <w:spacing w:before="0" w:after="40"/>
-      </w:pPr>
-      <w:r>
-        <w:rPr>
-          <w:b/>
-          <w:color w:val="64748B"/>
-          <w:sz w:val="17"/>
-        </w:rPr>
-        <w:t>[1M]</w:t>
-      </w:r>
-    </w:p>
-    <w:p>
-      <w:pPr>
-        <w:spacing w:before="80" w:after="40" w:line="276" w:lineRule="auto"/>
-      </w:pPr>
-      <w:r>
-        <w:rPr>
-          <w:b/>
-          <w:sz w:val="20"/>
-        </w:rPr>
-        <w:t xml:space="preserve">Q3. </w:t>
-      </w:r>
-      <w:r>
-        <w:rPr>
-          <w:sz w:val="20"/>
-        </w:rPr>
-        <w:t>The maximum value of static friction is called _______ friction.</w:t>
-      </w:r>
-    </w:p>
-    <w:p>
-      <w:pPr>
-        <w:spacing w:before="0" w:after="40"/>
-      </w:pPr>
-      <w:r>
-        <w:rPr>
-          <w:b/>
-          <w:color w:val="64748B"/>
-          <w:sz w:val="17"/>
-        </w:rPr>
-        <w:t>[1M]</w:t>
-      </w:r>
-    </w:p>
-    <w:p>
-      <w:pPr>
-        <w:spacing w:before="80" w:after="40" w:line="276" w:lineRule="auto"/>
-      </w:pPr>
-      <w:r>
-        <w:rPr>
-          <w:b/>
-          <w:sz w:val="20"/>
-        </w:rPr>
-        <w:t xml:space="preserve">Q4. </w:t>
-      </w:r>
-      <w:r>
-        <w:rPr>
-          <w:sz w:val="20"/>
-        </w:rPr>
-        <w:t>For a banking angle $\theta$ on a curved road of radius $r$, the optimum speed to avoid wear and tear of tires is given by $\text{v} =$ _______.</w:t>
+        <w:t>Banking of roads helps to provide the necessary _______ force for safe turning of vehicles without depending solely on friction.</w:t>
       </w:r>
     </w:p>
     <w:p>
@@ -1205,7 +914,7 @@
           <w:color w:val="1E1B4B"/>
           <w:sz w:val="22"/>
         </w:rPr>
-        <w:t>Section C: Assertion-Reason Type Questions</w:t>
+        <w:t>Section C: Assertion-Reason</w:t>
       </w:r>
     </w:p>
     <w:p>
@@ -1219,7 +928,7 @@
           <w:color w:val="64748B"/>
           <w:sz w:val="18"/>
         </w:rPr>
-        <w:t>Note: Read the assertion and reason carefully and choose the correct option: (a) Both Assertion and Reason are true and Reason is the correct explanation of Assertion. (b) Both Assertion and Reason are true but Reason is not the correct explanation of Assertion. (c) Assertion is true but Reason is false. (d) Assertion is false and Reason is true.</w:t>
+        <w:t>Note: Read the Assertion (A) and Reason (R) statements and choose the correct option.</w:t>
       </w:r>
     </w:p>
     <w:p>
@@ -1231,24 +940,13 @@
           <w:b/>
           <w:sz w:val="20"/>
         </w:rPr>
-        <w:t xml:space="preserve">Q1. </w:t>
+        <w:t xml:space="preserve">Q9. </w:t>
       </w:r>
       <w:r>
         <w:rPr>
           <w:sz w:val="20"/>
         </w:rPr>
-        <w:t>Assertion (A): A rocket works on the principle of conservation of linear momentum.</w:t>
-      </w:r>
-    </w:p>
-    <w:p>
-      <w:pPr>
-        <w:spacing w:before="20" w:after="40" w:line="276" w:lineRule="auto"/>
-      </w:pPr>
-      <w:r>
-        <w:rPr>
-          <w:sz w:val="20"/>
-        </w:rPr>
-        <w:t>Reason (B): The total momentum of an isolated system of interacting bodies remains conserved.</w:t>
+        <w:t>Assertion (A): The acceleration of an object is zero if the net external force acting on it is zero.\nReason (R): Newton's first law of motion defines inertia and serves as a definition of inertial frames of reference.</w:t>
       </w:r>
     </w:p>
     <w:p>
@@ -1273,7 +971,7 @@
         <w:rPr>
           <w:sz w:val="20"/>
         </w:rPr>
-        <w:t>(a) Both Assertion and Reason are true and Reason is the correct explanation of Assertion.</w:t>
+        <w:t>(a) Both A and R are True and R is the correct explanation of A</w:t>
       </w:r>
     </w:p>
     <w:p>
@@ -1285,7 +983,7 @@
         <w:rPr>
           <w:sz w:val="20"/>
         </w:rPr>
-        <w:t>(b) Both Assertion and Reason are true but Reason is not the correct explanation of Assertion.</w:t>
+        <w:t>(b) Both A and R are True but R is not the correct explanation of A</w:t>
       </w:r>
     </w:p>
     <w:p>
@@ -1297,7 +995,7 @@
         <w:rPr>
           <w:sz w:val="20"/>
         </w:rPr>
-        <w:t>(c) Assertion is true but Reason is false.</w:t>
+        <w:t>(c) A is True but R is False</w:t>
       </w:r>
     </w:p>
     <w:p>
@@ -1309,97 +1007,7 @@
         <w:rPr>
           <w:sz w:val="20"/>
         </w:rPr>
-        <w:t>(d) Assertion is false and Reason is true.</w:t>
-      </w:r>
-    </w:p>
-    <w:p>
-      <w:pPr>
-        <w:spacing w:before="80" w:after="40" w:line="276" w:lineRule="auto"/>
-      </w:pPr>
-      <w:r>
-        <w:rPr>
-          <w:b/>
-          <w:sz w:val="20"/>
-        </w:rPr>
-        <w:t xml:space="preserve">Q2. </w:t>
-      </w:r>
-      <w:r>
-        <w:rPr>
-          <w:sz w:val="20"/>
-        </w:rPr>
-        <w:t>Assertion (A): It is easier to pull a heavy lawn roller than to push it.</w:t>
-      </w:r>
-    </w:p>
-    <w:p>
-      <w:pPr>
-        <w:spacing w:before="20" w:after="40" w:line="276" w:lineRule="auto"/>
-      </w:pPr>
-      <w:r>
-        <w:rPr>
-          <w:sz w:val="20"/>
-        </w:rPr>
-        <w:t>Reason (B): Pulling creates a component of force acting upwards, which decreases the effective normal reaction and hence the limiting friction.</w:t>
-      </w:r>
-    </w:p>
-    <w:p>
-      <w:pPr>
-        <w:spacing w:before="0" w:after="40"/>
-      </w:pPr>
-      <w:r>
-        <w:rPr>
-          <w:b/>
-          <w:color w:val="64748B"/>
-          <w:sz w:val="17"/>
-        </w:rPr>
-        <w:t>[1M]</w:t>
-      </w:r>
-    </w:p>
-    <w:p>
-      <w:pPr>
-        <w:spacing w:before="80" w:after="40" w:line="276" w:lineRule="auto"/>
-        <w:ind w:left="454"/>
-      </w:pPr>
-      <w:r>
-        <w:rPr>
-          <w:sz w:val="20"/>
-        </w:rPr>
-        <w:t>(a) Both Assertion and Reason are true and Reason is the correct explanation of Assertion.</w:t>
-      </w:r>
-    </w:p>
-    <w:p>
-      <w:pPr>
-        <w:spacing w:before="80" w:after="40" w:line="276" w:lineRule="auto"/>
-        <w:ind w:left="454"/>
-      </w:pPr>
-      <w:r>
-        <w:rPr>
-          <w:sz w:val="20"/>
-        </w:rPr>
-        <w:t>(b) Both Assertion and Reason are true but Reason is not the correct explanation of Assertion.</w:t>
-      </w:r>
-    </w:p>
-    <w:p>
-      <w:pPr>
-        <w:spacing w:before="80" w:after="40" w:line="276" w:lineRule="auto"/>
-        <w:ind w:left="454"/>
-      </w:pPr>
-      <w:r>
-        <w:rPr>
-          <w:sz w:val="20"/>
-        </w:rPr>
-        <w:t>(c) Assertion is true but Reason is false.</w:t>
-      </w:r>
-    </w:p>
-    <w:p>
-      <w:pPr>
-        <w:spacing w:before="80" w:after="40" w:line="276" w:lineRule="auto"/>
-        <w:ind w:left="454"/>
-      </w:pPr>
-      <w:r>
-        <w:rPr>
-          <w:sz w:val="20"/>
-        </w:rPr>
-        <w:t>(d) Assertion is false and Reason is true.</w:t>
+        <w:t>(d) A is False but R is True</w:t>
       </w:r>
     </w:p>
     <w:p>
@@ -1413,7 +1021,7 @@
           <w:color w:val="1E1B4B"/>
           <w:sz w:val="22"/>
         </w:rPr>
-        <w:t>Section D: Very Short Answer Questions</w:t>
+        <w:t>Section D: Very Short Answer</w:t>
       </w:r>
     </w:p>
     <w:p>
@@ -1427,7 +1035,7 @@
           <w:color w:val="64748B"/>
           <w:sz w:val="18"/>
         </w:rPr>
-        <w:t>Note: Answer all questions in brief.</w:t>
+        <w:t>Note: Answer in one or two sentences.</w:t>
       </w:r>
     </w:p>
     <w:p>
@@ -1439,13 +1047,13 @@
           <w:b/>
           <w:sz w:val="20"/>
         </w:rPr>
-        <w:t xml:space="preserve">Q1. </w:t>
+        <w:t xml:space="preserve">Q10. </w:t>
       </w:r>
       <w:r>
         <w:rPr>
           <w:sz w:val="20"/>
         </w:rPr>
-        <w:t>State Newton's second law of motion in terms of momentum and write its mathematical form in vector notation.</w:t>
+        <w:t>State Newton's third law of motion and give one common example.</w:t>
       </w:r>
     </w:p>
     <w:p>
@@ -1470,13 +1078,13 @@
           <w:b/>
           <w:sz w:val="20"/>
         </w:rPr>
-        <w:t xml:space="preserve">Q2. </w:t>
+        <w:t xml:space="preserve">Q11. </w:t>
       </w:r>
       <w:r>
         <w:rPr>
           <w:sz w:val="20"/>
         </w:rPr>
-        <w:t>Why are wheels provided with mudguards? Explain briefly on the basis of laws of motion.</w:t>
+        <w:t>Why are tyres of vehicles provided with irregular grooves or treads?</w:t>
       </w:r>
     </w:p>
     <w:p>
@@ -1501,44 +1109,13 @@
           <w:b/>
           <w:sz w:val="20"/>
         </w:rPr>
-        <w:t xml:space="preserve">Q3. </w:t>
+        <w:t xml:space="preserve">Q12. </w:t>
       </w:r>
       <w:r>
         <w:rPr>
           <w:sz w:val="20"/>
         </w:rPr>
-        <w:t>Define angle of friction. Prove that the coefficient of static friction is equal to the tangent of the angle of friction.</w:t>
-      </w:r>
-    </w:p>
-    <w:p>
-      <w:pPr>
-        <w:spacing w:before="0" w:after="40"/>
-      </w:pPr>
-      <w:r>
-        <w:rPr>
-          <w:b/>
-          <w:color w:val="64748B"/>
-          <w:sz w:val="17"/>
-        </w:rPr>
-        <w:t>[2M]</w:t>
-      </w:r>
-    </w:p>
-    <w:p>
-      <w:pPr>
-        <w:spacing w:before="80" w:after="40" w:line="276" w:lineRule="auto"/>
-      </w:pPr>
-      <w:r>
-        <w:rPr>
-          <w:b/>
-          <w:sz w:val="20"/>
-        </w:rPr>
-        <w:t xml:space="preserve">Q4. </w:t>
-      </w:r>
-      <w:r>
-        <w:rPr>
-          <w:sz w:val="20"/>
-        </w:rPr>
-        <w:t>A batsman deflects a ball by an angle of $60^{\circ}$ without changing its initial speed of $54\text{ km/h}$. Calculate the impulse imparted to the ball if its mass is $0.15\text{ kg}$.</w:t>
+        <w:t>Define impulse of a force. State its relation with change in momentum.</w:t>
       </w:r>
     </w:p>
     <w:p>
@@ -1565,7 +1142,7 @@
           <w:color w:val="1E1B4B"/>
           <w:sz w:val="22"/>
         </w:rPr>
-        <w:t>Section E: Short Answer Questions</w:t>
+        <w:t>Section E: Short Answer</w:t>
       </w:r>
     </w:p>
     <w:p>
@@ -1579,7 +1156,7 @@
           <w:color w:val="64748B"/>
           <w:sz w:val="18"/>
         </w:rPr>
-        <w:t>Note: Answer all questions with proper derivations or step-by-step solutions.</w:t>
+        <w:t>Note: Answer in 30 to 50 words.</w:t>
       </w:r>
     </w:p>
     <w:p>
@@ -1591,13 +1168,13 @@
           <w:b/>
           <w:sz w:val="20"/>
         </w:rPr>
-        <w:t xml:space="preserve">Q1. </w:t>
+        <w:t xml:space="preserve">Q13. </w:t>
       </w:r>
       <w:r>
         <w:rPr>
           <w:sz w:val="20"/>
         </w:rPr>
-        <w:t>State and prove the Law of Conservation of Linear Momentum using Newton's third law of motion.</w:t>
+        <w:t>Explain why it is easier to pull a lawn mower than to push it.</w:t>
       </w:r>
     </w:p>
     <w:p>
@@ -1622,13 +1199,13 @@
           <w:b/>
           <w:sz w:val="20"/>
         </w:rPr>
-        <w:t xml:space="preserve">Q2. </w:t>
+        <w:t xml:space="preserve">Q14. </w:t>
       </w:r>
       <w:r>
         <w:rPr>
           <w:sz w:val="20"/>
         </w:rPr>
-        <w:t>Derive an expression for the maximum safe speed of a vehicle on a banked circular road of radius $r$ and banking angle $\theta$, taking friction into account.</w:t>
+        <w:t>A batsman hits a ball straight back to the bowler without changing its initial speed of  12\ m/s . If the mass of the ball is  0.15\ kg , calculate the impulse imparted to the ball. (Assume linear motion)</w:t>
       </w:r>
     </w:p>
     <w:p>
@@ -1653,86 +1230,13 @@
           <w:b/>
           <w:sz w:val="20"/>
         </w:rPr>
-        <w:t xml:space="preserve">Q3. </w:t>
+        <w:t xml:space="preserve">Q15. </w:t>
       </w:r>
       <w:r>
         <w:rPr>
           <w:sz w:val="20"/>
         </w:rPr>
-        <w:t>Two masses $m_1 = 4\text{ kg}$ and $m_2 = 6\text{ kg}$ are connected by a light string passing over a frictionless fixed pulley. Find the acceleration of the masses and the tension in the string when the masses are released.</w:t>
-      </w:r>
-    </w:p>
-    <w:p>
-      <w:pPr>
-        <w:spacing w:before="0" w:after="40"/>
-      </w:pPr>
-      <w:r>
-        <w:rPr>
-          <w:b/>
-          <w:color w:val="64748B"/>
-          <w:sz w:val="17"/>
-        </w:rPr>
-        <w:t>[3M]</w:t>
-      </w:r>
-    </w:p>
-    <w:p>
-      <w:pPr>
-        <w:spacing w:before="80" w:after="120"/>
-        <w:jc w:val="center"/>
-      </w:pPr>
-    </w:p>
-    <w:p>
-      <w:r>
-        <w:drawing>
-          <wp:inline xmlns:a="http://schemas.openxmlformats.org/drawingml/2006/main" xmlns:pic="http://schemas.openxmlformats.org/drawingml/2006/picture">
-            <wp:extent cx="2926080" cy="6217920"/>
-            <wp:docPr id="3" name="Picture 3"/>
-            <wp:cNvGraphicFramePr>
-              <a:graphicFrameLocks noChangeAspect="1"/>
-            </wp:cNvGraphicFramePr>
-            <a:graphic>
-              <a:graphicData uri="http://schemas.openxmlformats.org/drawingml/2006/picture">
-                <pic:pic>
-                  <pic:nvPicPr>
-                    <pic:cNvPr id="0" name="ncert_Section_E_q3.png"/>
-                    <pic:cNvPicPr/>
-                  </pic:nvPicPr>
-                  <pic:blipFill>
-                    <a:blip r:embed="rId13"/>
-                    <a:stretch>
-                      <a:fillRect/>
-                    </a:stretch>
-                  </pic:blipFill>
-                  <pic:spPr>
-                    <a:xfrm>
-                      <a:off x="0" y="0"/>
-                      <a:ext cx="2926080" cy="6217920"/>
-                    </a:xfrm>
-                    <a:prstGeom prst="rect"/>
-                  </pic:spPr>
-                </pic:pic>
-              </a:graphicData>
-            </a:graphic>
-          </wp:inline>
-        </w:drawing>
-      </w:r>
-    </w:p>
-    <w:p>
-      <w:pPr>
-        <w:spacing w:before="80" w:after="40" w:line="276" w:lineRule="auto"/>
-      </w:pPr>
-      <w:r>
-        <w:rPr>
-          <w:b/>
-          <w:sz w:val="20"/>
-        </w:rPr>
-        <w:t xml:space="preserve">Q4. </w:t>
-      </w:r>
-      <w:r>
-        <w:rPr>
-          <w:sz w:val="20"/>
-        </w:rPr>
-        <w:t>Explain why centripetal force is necessary for circular motion. A stone of mass $1\text{ kg}$ tied to the end of a string of length $1\text{ m}$ is whirled in a horizontal circle at a angular speed of $2\text{ rad/s}$. What is the maximum tension the string can bear if it breaks at a breaking tension of $10\text{ N}$? Compute the maximum angular velocity.</w:t>
+        <w:t>Derive the expression for the maximum safe speed of a vehicle on a banked circular road with friction coefficient  μ .</w:t>
       </w:r>
     </w:p>
     <w:p>
@@ -1759,7 +1263,7 @@
           <w:color w:val="1E1B4B"/>
           <w:sz w:val="22"/>
         </w:rPr>
-        <w:t>Section F: Long Answer Questions</w:t>
+        <w:t>Section F: Long Answer</w:t>
       </w:r>
     </w:p>
     <w:p>
@@ -1773,7 +1277,7 @@
           <w:color w:val="64748B"/>
           <w:sz w:val="18"/>
         </w:rPr>
-        <w:t>Note: Provide detailed answers with complete derivations and numerical steps.</w:t>
+        <w:t>Note: Answer in detail with diagrams, steps, or derivations where applicable.</w:t>
       </w:r>
     </w:p>
     <w:p>
@@ -1785,24 +1289,13 @@
           <w:b/>
           <w:sz w:val="20"/>
         </w:rPr>
-        <w:t xml:space="preserve">Q1. </w:t>
+        <w:t xml:space="preserve">Q16. </w:t>
       </w:r>
       <w:r>
         <w:rPr>
           <w:sz w:val="20"/>
         </w:rPr>
-        <w:t>(a) Define friction. Distinguish between static friction, kinetic friction, and rolling friction.</w:t>
-      </w:r>
-    </w:p>
-    <w:p>
-      <w:pPr>
-        <w:spacing w:before="20" w:after="40" w:line="276" w:lineRule="auto"/>
-      </w:pPr>
-      <w:r>
-        <w:rPr>
-          <w:sz w:val="20"/>
-        </w:rPr>
-        <w:t>(b) A block of mass $10\text{ kg}$ rests on a horizontal plane. The coefficient of static friction is $0.5$ and kinetic friction is $0.3$. Calculate the frictional force acting on the block if a horizontal force of $20\text{ N}$ is applied, and also when the applied force becomes $60\text{ N}$. ($g = 10\text{ m/s}^2$)</w:t>
+        <w:t>State the Law of Conservation of Linear Momentum. Prove it using Newton's third law of motion for an isolated system of two interacting particles. Also, explain how recoil of a gun is an application of this law.</w:t>
       </w:r>
     </w:p>
     <w:p>
@@ -1815,218 +1308,7 @@
           <w:color w:val="64748B"/>
           <w:sz w:val="17"/>
         </w:rPr>
-        <w:t>[5M]</w:t>
-      </w:r>
-    </w:p>
-    <w:p>
-      <w:pPr>
-        <w:spacing w:before="80" w:after="40" w:line="276" w:lineRule="auto"/>
-      </w:pPr>
-      <w:r>
-        <w:rPr>
-          <w:b/>
-          <w:sz w:val="20"/>
-        </w:rPr>
-        <w:t xml:space="preserve">Q2. </w:t>
-      </w:r>
-      <w:r>
-        <w:rPr>
-          <w:sz w:val="20"/>
-        </w:rPr>
-        <w:t>(a) Using free-body diagrams, find the acceleration of a body sliding down a rough inclined plane making an angle $\theta$ with the horizontal, where $\mu_k$ is the coefficient of kinetic friction.</w:t>
-      </w:r>
-    </w:p>
-    <w:p>
-      <w:pPr>
-        <w:spacing w:before="20" w:after="40" w:line="276" w:lineRule="auto"/>
-      </w:pPr>
-      <w:r>
-        <w:rPr>
-          <w:sz w:val="20"/>
-        </w:rPr>
-        <w:t>(b) A block takes twice as much time to slide down a $45^{\circ}$ rough incline as it takes to slide down a frictionless $45^{\circ}$ incline of the same length. Calculate the coefficient of kinetic friction between the block and the rough incline.</w:t>
-      </w:r>
-    </w:p>
-    <w:p>
-      <w:pPr>
-        <w:spacing w:before="0" w:after="40"/>
-      </w:pPr>
-      <w:r>
-        <w:rPr>
-          <w:b/>
-          <w:color w:val="64748B"/>
-          <w:sz w:val="17"/>
-        </w:rPr>
-        <w:t>[5M]</w:t>
-      </w:r>
-    </w:p>
-    <w:p>
-      <w:pPr>
-        <w:spacing w:before="80" w:after="120"/>
-        <w:jc w:val="center"/>
-      </w:pPr>
-    </w:p>
-    <w:p>
-      <w:r>
-        <w:drawing>
-          <wp:inline xmlns:a="http://schemas.openxmlformats.org/drawingml/2006/main" xmlns:pic="http://schemas.openxmlformats.org/drawingml/2006/picture">
-            <wp:extent cx="2926080" cy="2280062"/>
-            <wp:docPr id="4" name="Picture 4"/>
-            <wp:cNvGraphicFramePr>
-              <a:graphicFrameLocks noChangeAspect="1"/>
-            </wp:cNvGraphicFramePr>
-            <a:graphic>
-              <a:graphicData uri="http://schemas.openxmlformats.org/drawingml/2006/picture">
-                <pic:pic>
-                  <pic:nvPicPr>
-                    <pic:cNvPr id="0" name="math_coordinate_geometry_cartesian.png"/>
-                    <pic:cNvPicPr/>
-                  </pic:nvPicPr>
-                  <pic:blipFill>
-                    <a:blip r:embed="rId14"/>
-                    <a:stretch>
-                      <a:fillRect/>
-                    </a:stretch>
-                  </pic:blipFill>
-                  <pic:spPr>
-                    <a:xfrm>
-                      <a:off x="0" y="0"/>
-                      <a:ext cx="2926080" cy="2280062"/>
-                    </a:xfrm>
-                    <a:prstGeom prst="rect"/>
-                  </pic:spPr>
-                </pic:pic>
-              </a:graphicData>
-            </a:graphic>
-          </wp:inline>
-        </w:drawing>
-      </w:r>
-    </w:p>
-    <w:p>
-      <w:pPr>
-        <w:keepNext/>
-        <w:spacing w:before="240" w:after="40"/>
-      </w:pPr>
-      <w:r>
-        <w:rPr>
-          <w:b/>
-          <w:color w:val="1E1B4B"/>
-          <w:sz w:val="22"/>
-        </w:rPr>
-        <w:t>Section G: Case Study Based Question</w:t>
-      </w:r>
-    </w:p>
-    <w:p>
-      <w:pPr>
-        <w:keepNext/>
-        <w:spacing w:after="120"/>
-      </w:pPr>
-      <w:r>
-        <w:rPr>
-          <w:i/>
-          <w:color w:val="64748B"/>
-          <w:sz w:val="18"/>
-        </w:rPr>
-        <w:t>Note: Read the passage carefully and answer the questions that follow.</w:t>
-      </w:r>
-    </w:p>
-    <w:p>
-      <w:pPr>
-        <w:spacing w:before="80" w:after="40" w:line="276" w:lineRule="auto"/>
-      </w:pPr>
-      <w:r>
-        <w:rPr>
-          <w:b/>
-          <w:sz w:val="20"/>
-        </w:rPr>
-        <w:t xml:space="preserve">Q1. </w:t>
-      </w:r>
-      <w:r>
-        <w:rPr>
-          <w:sz w:val="20"/>
-        </w:rPr>
-        <w:t>Read the following passage on Newton's laws of motion and dynamic equilibrium, and answer the sub-questions below:</w:t>
-      </w:r>
-    </w:p>
-    <w:p>
-      <w:pPr>
-        <w:spacing w:before="20" w:after="40" w:line="276" w:lineRule="auto"/>
-      </w:pPr>
-      <w:r>
-        <w:rPr>
-          <w:sz w:val="20"/>
-        </w:rPr>
-        <w:t>Newton's first law defines inertial frames of reference and states that a body continues in its state of rest or uniform motion unless acted upon by an external net force. Newton's second law quantifies force as the rate of change of linear momentum. In many real-world engineering problems, systems are analyzed using connected bodies, pulleys, lifts, and inclined planes where constraints dictate the motion. When all forces balance out, the body is in translational equilibrium.</w:t>
-      </w:r>
-    </w:p>
-    <w:p>
-      <w:pPr>
-        <w:spacing w:before="0" w:after="40"/>
-      </w:pPr>
-      <w:r>
-        <w:rPr>
-          <w:b/>
-          <w:color w:val="64748B"/>
-          <w:sz w:val="17"/>
-        </w:rPr>
-        <w:t>[4M]</w:t>
-      </w:r>
-    </w:p>
-    <w:p>
-      <w:pPr>
-        <w:spacing w:before="80" w:after="40" w:line="276" w:lineRule="auto"/>
-        <w:ind w:left="454"/>
-      </w:pPr>
-      <w:r>
-        <w:rPr>
-          <w:b/>
-          <w:sz w:val="20"/>
-        </w:rPr>
-        <w:t xml:space="preserve">(a) </w:t>
-      </w:r>
-      <w:r>
-        <w:rPr>
-          <w:sz w:val="20"/>
-        </w:rPr>
-        <w:t>What is an inertial frame of reference? Give one example.</w:t>
-      </w:r>
-    </w:p>
-    <w:p>
-      <w:pPr>
-        <w:spacing w:before="80" w:after="40" w:line="276" w:lineRule="auto"/>
-        <w:ind w:left="454"/>
-      </w:pPr>
-      <w:r>
-        <w:rPr>
-          <w:b/>
-          <w:sz w:val="20"/>
-        </w:rPr>
-        <w:t xml:space="preserve">(b) </w:t>
-      </w:r>
-      <w:r>
-        <w:rPr>
-          <w:sz w:val="20"/>
-        </w:rPr>
-        <w:t>Why is Newton's first law considered not merely a special case of Newton's second law, but fundamental?</w:t>
-      </w:r>
-    </w:p>
-    <w:p>
-      <w:pPr>
-        <w:spacing w:before="80" w:after="40" w:line="276" w:lineRule="auto"/>
-        <w:ind w:left="454"/>
-      </w:pPr>
-      <w:r>
-        <w:rPr>
-          <w:b/>
-          <w:sz w:val="20"/>
-        </w:rPr>
-        <w:t xml:space="preserve">(c) </w:t>
-      </w:r>
-      <w:r>
-        <w:rPr>
-          <w:sz w:val="20"/>
-        </w:rPr>
-        <w:t>A lift of mass $500\text{ kg}$ is ascending with an upward acceleration of $2\text{ m/s}^2$. Calculate the tension in the supporting cable. ($g = 9.8\text{ m/s}^2$)</w:t>
+        <w:t>[6M]</w:t>
       </w:r>
     </w:p>
     <w:p>
@@ -2090,7 +1372,7 @@
         <w:color w:val="8C8C8C"/>
         <w:sz w:val="17"/>
       </w:rPr>
-      <w:t>RRB Group of Schools  |  DESCRIPTIVE PAPER — Class 11 PHYSICS</w:t>
+      <w:t>Lotus Academy  |  DESCRIPTIVE PAPER — Class 11 PHYSICS</w:t>
     </w:r>
   </w:p>
 </w:hdr>

</xml_diff>